<commit_message>
subida de archivos fase2
</commit_message>
<xml_diff>
--- a/Fase 2/Parte 2/Edgardo_Gutierrez_2.1_APT122_DiarioReflexionFase2.docx
+++ b/Fase 2/Parte 2/Edgardo_Gutierrez_2.1_APT122_DiarioReflexionFase2.docx
@@ -70,12 +70,12 @@
                 <wp:inline distB="0" distT="0" distL="0" distR="0">
                   <wp:extent cx="393640" cy="444500"/>
                   <wp:effectExtent b="0" l="0" r="0" t="0"/>
-                  <wp:docPr id="17580" name="image3.png"/>
+                  <wp:docPr id="17580" name="image1.png"/>
                   <a:graphic>
                     <a:graphicData uri="http://schemas.openxmlformats.org/drawingml/2006/picture">
                       <pic:pic>
                         <pic:nvPicPr>
-                          <pic:cNvPr id="0" name="image3.png"/>
+                          <pic:cNvPr id="0" name="image1.png"/>
                           <pic:cNvPicPr preferRelativeResize="0"/>
                         </pic:nvPicPr>
                         <pic:blipFill>
@@ -345,12 +345,8 @@
             </w:pPr>
             <w:r>
               <w:rPr>
-                <w:color w:val="767171"/>
-                <w:sz w:val="24"/>
-                <w:szCs w:val="24"/>
-                <w:rtl w:val="0"/>
-              </w:rPr>
-              <w:t xml:space="preserve">a</w:t>
+                <w:rtl w:val="0"/>
+              </w:rPr>
             </w:r>
           </w:p>
           <w:p>
@@ -363,6 +359,15 @@
                 <w:color w:val="1f4e79"/>
               </w:rPr>
             </w:pPr>
+            <w:r>
+              <w:rPr>
+                <w:b w:val="1"/>
+                <w:bCs w:val="1"/>
+                <w:color w:val="1f4e79"/>
+                <w:rtl w:val="0"/>
+              </w:rPr>
+              <w:t xml:space="preserve">Si, pudimos cumplir con las actividades que coordinamos con el cliente, mantenemos una comunicación constante y mediante el uso de herramientas de control de versiones como github. dadas las reuniones que hemos tenido con Andres Cordero nos ha presentado el desafío de agregar nuevas funciones para el proyecto pero nos encontramos avanzando de forma positiva.</w:t>
+            </w:r>
             <w:r>
               <w:rPr>
                 <w:rtl w:val="0"/>
@@ -542,6 +547,15 @@
             </w:pPr>
             <w:r>
               <w:rPr>
+                <w:b w:val="1"/>
+                <w:bCs w:val="1"/>
+                <w:color w:val="1f4e79"/>
+                <w:rtl w:val="0"/>
+              </w:rPr>
+              <w:t xml:space="preserve">Enfrentamos las nuevas modificaciones y agregar nuevos requerimientos que fueron solicitados por el cliente, manteniendo una comunicación con el para priorizar las funcionalidades claves y que no comprometa los tiempos de entrega.</w:t>
+            </w:r>
+            <w:r>
+              <w:rPr>
                 <w:rtl w:val="0"/>
               </w:rPr>
             </w:r>
@@ -855,6 +869,15 @@
             </w:pPr>
             <w:r>
               <w:rPr>
+                <w:b w:val="1"/>
+                <w:bCs w:val="1"/>
+                <w:color w:val="1f4e79"/>
+                <w:rtl w:val="0"/>
+              </w:rPr>
+              <w:t xml:space="preserve">El trabajo realizado hasta este momento lo evaluó de manera positiva, destacó que el cliente le gusta la propuesta y el avance presentado hasta la fecha. Como mejora nos quedan por ver detalles de las tareas pendientes por finalizar debemos optimizar el tiempo de trabajo para las próximas semanas.</w:t>
+            </w:r>
+            <w:r>
+              <w:rPr>
                 <w:rtl w:val="0"/>
               </w:rPr>
             </w:r>
@@ -1042,6 +1065,15 @@
             </w:pPr>
             <w:r>
               <w:rPr>
+                <w:b w:val="1"/>
+                <w:bCs w:val="1"/>
+                <w:color w:val="1f4e79"/>
+                <w:rtl w:val="0"/>
+              </w:rPr>
+              <w:t xml:space="preserve">Mi inquietud está relacionada con el diseño y la optimización de la base de datos, se ha dificultado la estructura del modelo y que se asegure su escalabilidad cuando aparezcan nuevas exigencias del cliente. me gustaría preguntar a mi docente o a mis pares, cuál fue la mejor estrategia o práctica para estructurar y optimizar el diseño de la base de datos.</w:t>
+            </w:r>
+            <w:r>
+              <w:rPr>
                 <w:rtl w:val="0"/>
               </w:rPr>
             </w:r>
@@ -1243,42 +1275,21 @@
             <w:pPr>
               <w:jc w:val="both"/>
               <w:rPr>
-                <w:color w:val="767171"/>
-                <w:sz w:val="24"/>
-                <w:szCs w:val="24"/>
-              </w:rPr>
-            </w:pPr>
-            <w:r>
-              <w:rPr>
-                <w:rtl w:val="0"/>
-              </w:rPr>
-            </w:r>
-          </w:p>
-          <w:p>
-            <w:pPr>
-              <w:jc w:val="both"/>
-              <w:rPr>
-                <w:color w:val="767171"/>
-                <w:sz w:val="24"/>
-                <w:szCs w:val="24"/>
-              </w:rPr>
-            </w:pPr>
-            <w:r>
-              <w:rPr>
-                <w:rtl w:val="0"/>
-              </w:rPr>
-            </w:r>
-          </w:p>
-          <w:p>
-            <w:pPr>
-              <w:jc w:val="both"/>
-              <w:rPr>
                 <w:rFonts w:ascii="Calibri" w:cs="Calibri" w:eastAsia="Calibri" w:hAnsi="Calibri"/>
                 <w:b w:val="1"/>
                 <w:bCs w:val="1"/>
                 <w:color w:val="1f4e79"/>
               </w:rPr>
             </w:pPr>
+            <w:r>
+              <w:rPr>
+                <w:b w:val="1"/>
+                <w:bCs w:val="1"/>
+                <w:color w:val="1f4e79"/>
+                <w:rtl w:val="0"/>
+              </w:rPr>
+              <w:t xml:space="preserve">Consideramos que si deberíamos realizar la redistribución de actividades por los nuevos requerimientos que el cliente nos brindó y la complejidad en el módulo de base de datos.</w:t>
+            </w:r>
             <w:r>
               <w:rPr>
                 <w:rtl w:val="0"/>
@@ -1436,57 +1447,21 @@
             <w:pPr>
               <w:jc w:val="both"/>
               <w:rPr>
-                <w:color w:val="767171"/>
-                <w:sz w:val="24"/>
-                <w:szCs w:val="24"/>
-              </w:rPr>
-            </w:pPr>
-            <w:r>
-              <w:rPr>
-                <w:rtl w:val="0"/>
-              </w:rPr>
-            </w:r>
-          </w:p>
-          <w:p>
-            <w:pPr>
-              <w:jc w:val="both"/>
-              <w:rPr>
-                <w:color w:val="767171"/>
-                <w:sz w:val="24"/>
-                <w:szCs w:val="24"/>
-              </w:rPr>
-            </w:pPr>
-            <w:r>
-              <w:rPr>
-                <w:rtl w:val="0"/>
-              </w:rPr>
-            </w:r>
-          </w:p>
-          <w:p>
-            <w:pPr>
-              <w:jc w:val="both"/>
-              <w:rPr>
-                <w:color w:val="767171"/>
-                <w:sz w:val="24"/>
-                <w:szCs w:val="24"/>
-              </w:rPr>
-            </w:pPr>
-            <w:r>
-              <w:rPr>
-                <w:rtl w:val="0"/>
-              </w:rPr>
-            </w:r>
-          </w:p>
-          <w:p>
-            <w:pPr>
-              <w:jc w:val="both"/>
-              <w:rPr>
                 <w:rFonts w:ascii="Calibri" w:cs="Calibri" w:eastAsia="Calibri" w:hAnsi="Calibri"/>
                 <w:b w:val="1"/>
                 <w:bCs w:val="1"/>
                 <w:color w:val="1f4e79"/>
               </w:rPr>
             </w:pPr>
+            <w:r>
+              <w:rPr>
+                <w:b w:val="1"/>
+                <w:bCs w:val="1"/>
+                <w:color w:val="1f4e79"/>
+                <w:rtl w:val="0"/>
+              </w:rPr>
+              <w:t xml:space="preserve">Evaluamos el trabajo en grupo de manera muy positiva, ya que hemos logrado consolidar un equipo colaborativo, comprometido y con buena disposición para apoyarse mutuamente ante los desafíos del desarrollo. Destacamos la comunicación constante, el respeto por los acuerdos y la flexibilidad para adaptarnos a las nuevas solicitudes del cliente y redistribuir tareas cuando ha sido necesario. Como aspecto a mejorar, consideramos que debemos coordinar de forma más ágil los tiempos de integración entre los distintos módulos del software y establecer reuniones de seguimiento más breves pero frecuentes, asegurando así un avance uniforme y sin sobrecargas en la etapa final del proyecto.</w:t>
+            </w:r>
             <w:r>
               <w:rPr>
                 <w:rtl w:val="0"/>
@@ -1982,12 +1957,12 @@
               <wp:inline distB="0" distT="0" distL="0" distR="0">
                 <wp:extent cx="1996440" cy="428625"/>
                 <wp:effectExtent b="0" l="0" r="0" t="0"/>
-                <wp:docPr descr="http://www.duoc.cl/normasgraficas/normasgraficas/marca-duoc/6logo-fondo-transparente/fondo-transparente.png" id="17582" name="image1.png"/>
+                <wp:docPr descr="http://www.duoc.cl/normasgraficas/normasgraficas/marca-duoc/6logo-fondo-transparente/fondo-transparente.png" id="17582" name="image3.png"/>
                 <a:graphic>
                   <a:graphicData uri="http://schemas.openxmlformats.org/drawingml/2006/picture">
                     <pic:pic>
                       <pic:nvPicPr>
-                        <pic:cNvPr descr="http://www.duoc.cl/normasgraficas/normasgraficas/marca-duoc/6logo-fondo-transparente/fondo-transparente.png" id="0" name="image1.png"/>
+                        <pic:cNvPr descr="http://www.duoc.cl/normasgraficas/normasgraficas/marca-duoc/6logo-fondo-transparente/fondo-transparente.png" id="0" name="image3.png"/>
                         <pic:cNvPicPr preferRelativeResize="0"/>
                       </pic:nvPicPr>
                       <pic:blipFill>
@@ -2173,12 +2148,12 @@
               <wp:inline distB="0" distT="0" distL="0" distR="0">
                 <wp:extent cx="361950" cy="581025"/>
                 <wp:effectExtent b="0" l="0" r="0" t="0"/>
-                <wp:docPr id="17581" name="image4.png"/>
+                <wp:docPr id="17581" name="image2.png"/>
                 <a:graphic>
                   <a:graphicData uri="http://schemas.openxmlformats.org/drawingml/2006/picture">
                     <pic:pic>
                       <pic:nvPicPr>
-                        <pic:cNvPr id="0" name="image4.png"/>
+                        <pic:cNvPr id="0" name="image2.png"/>
                         <pic:cNvPicPr preferRelativeResize="0"/>
                       </pic:nvPicPr>
                       <pic:blipFill>
@@ -2329,12 +2304,12 @@
               <wp:inline distB="0" distT="0" distL="0" distR="0">
                 <wp:extent cx="1895475" cy="466725"/>
                 <wp:effectExtent b="0" l="0" r="0" t="0"/>
-                <wp:docPr id="17583" name="image2.png"/>
+                <wp:docPr id="17583" name="image4.png"/>
                 <a:graphic>
                   <a:graphicData uri="http://schemas.openxmlformats.org/drawingml/2006/picture">
                     <pic:pic>
                       <pic:nvPicPr>
-                        <pic:cNvPr id="0" name="image2.png"/>
+                        <pic:cNvPr id="0" name="image4.png"/>
                         <pic:cNvPicPr preferRelativeResize="0"/>
                       </pic:nvPicPr>
                       <pic:blipFill>

</xml_diff>